<commit_message>
update part 3 lab
</commit_message>
<xml_diff>
--- a/part3-lab/Part3_Lab_Log.docx
+++ b/part3-lab/Part3_Lab_Log.docx
@@ -8961,6 +8961,352 @@
         </w:rPr>
       </w:pPr>
     </w:p>
+    <w:p>
+      <w:pPr>
+        <w:rPr>
+          <w:b/>
+          <w:bCs/>
+          <w:sz w:val="28"/>
+          <w:szCs w:val="28"/>
+        </w:rPr>
+      </w:pPr>
+      <w:r>
+        <w:rPr>
+          <w:b/>
+          <w:bCs/>
+          <w:sz w:val="28"/>
+          <w:szCs w:val="28"/>
+        </w:rPr>
+        <w:t>Step 5: Fixed layout (JSON) and Python</w:t>
+      </w:r>
+    </w:p>
+    <w:p>
+      <w:pPr>
+        <w:rPr>
+          <w:b/>
+          <w:bCs/>
+          <w:sz w:val="20"/>
+          <w:szCs w:val="20"/>
+        </w:rPr>
+      </w:pPr>
+      <w:r>
+        <w:rPr>
+          <w:b/>
+          <w:bCs/>
+          <w:sz w:val="20"/>
+          <w:szCs w:val="20"/>
+        </w:rPr>
+        <w:t>Prompt:</w:t>
+      </w:r>
+    </w:p>
+    <w:p>
+      <w:pPr>
+        <w:rPr>
+          <w:sz w:val="20"/>
+          <w:szCs w:val="20"/>
+        </w:rPr>
+      </w:pPr>
+      <w:r>
+        <w:rPr>
+          <w:sz w:val="20"/>
+          <w:szCs w:val="20"/>
+        </w:rPr>
+        <w:t>Extract the person's details from the text below.</w:t>
+      </w:r>
+    </w:p>
+    <w:p>
+      <w:pPr>
+        <w:rPr>
+          <w:sz w:val="20"/>
+          <w:szCs w:val="20"/>
+        </w:rPr>
+      </w:pPr>
+      <w:r>
+        <w:rPr>
+          <w:sz w:val="20"/>
+          <w:szCs w:val="20"/>
+        </w:rPr>
+        <w:t>Return valid JSON only. No markdown fences. No explanation.</w:t>
+      </w:r>
+    </w:p>
+    <w:p>
+      <w:pPr>
+        <w:rPr>
+          <w:sz w:val="20"/>
+          <w:szCs w:val="20"/>
+        </w:rPr>
+      </w:pPr>
+      <w:r>
+        <w:rPr>
+          <w:sz w:val="20"/>
+          <w:szCs w:val="20"/>
+        </w:rPr>
+        <w:t>Use exactly these keys: name, age, occupation, city, research_area.</w:t>
+      </w:r>
+    </w:p>
+    <w:p>
+      <w:pPr>
+        <w:rPr>
+          <w:sz w:val="20"/>
+          <w:szCs w:val="20"/>
+        </w:rPr>
+      </w:pPr>
+      <w:r>
+        <w:rPr>
+          <w:sz w:val="20"/>
+          <w:szCs w:val="20"/>
+        </w:rPr>
+        <w:t>Text:</w:t>
+      </w:r>
+    </w:p>
+    <w:p>
+      <w:pPr>
+        <w:rPr>
+          <w:sz w:val="20"/>
+          <w:szCs w:val="20"/>
+        </w:rPr>
+      </w:pPr>
+      <w:r>
+        <w:rPr>
+          <w:sz w:val="20"/>
+          <w:szCs w:val="20"/>
+        </w:rPr>
+        <w:lastRenderedPageBreak/>
+        <w:t>John Smith is a 35-year-old Data Scientist living in Kigali and working in AI research on crop yield prediction.</w:t>
+      </w:r>
+    </w:p>
+    <w:p>
+      <w:pPr>
+        <w:rPr>
+          <w:sz w:val="20"/>
+          <w:szCs w:val="20"/>
+        </w:rPr>
+      </w:pPr>
+    </w:p>
+    <w:p>
+      <w:pPr>
+        <w:rPr>
+          <w:b/>
+          <w:bCs/>
+          <w:sz w:val="20"/>
+          <w:szCs w:val="20"/>
+        </w:rPr>
+      </w:pPr>
+      <w:r>
+        <w:rPr>
+          <w:b/>
+          <w:bCs/>
+          <w:sz w:val="20"/>
+          <w:szCs w:val="20"/>
+        </w:rPr>
+        <w:t>Raw model reply:</w:t>
+      </w:r>
+    </w:p>
+    <w:p>
+      <w:pPr>
+        <w:rPr>
+          <w:sz w:val="20"/>
+          <w:szCs w:val="20"/>
+        </w:rPr>
+      </w:pPr>
+      <w:r>
+        <w:rPr>
+          <w:sz w:val="20"/>
+          <w:szCs w:val="20"/>
+        </w:rPr>
+        <w:t>{</w:t>
+      </w:r>
+    </w:p>
+    <w:p>
+      <w:pPr>
+        <w:rPr>
+          <w:sz w:val="20"/>
+          <w:szCs w:val="20"/>
+        </w:rPr>
+      </w:pPr>
+      <w:r>
+        <w:rPr>
+          <w:sz w:val="20"/>
+          <w:szCs w:val="20"/>
+        </w:rPr>
+        <w:t>"name": "John Smith",</w:t>
+      </w:r>
+    </w:p>
+    <w:p>
+      <w:pPr>
+        <w:rPr>
+          <w:sz w:val="20"/>
+          <w:szCs w:val="20"/>
+        </w:rPr>
+      </w:pPr>
+      <w:r>
+        <w:rPr>
+          <w:sz w:val="20"/>
+          <w:szCs w:val="20"/>
+        </w:rPr>
+        <w:t>"age": "35",</w:t>
+      </w:r>
+    </w:p>
+    <w:p>
+      <w:pPr>
+        <w:rPr>
+          <w:sz w:val="20"/>
+          <w:szCs w:val="20"/>
+        </w:rPr>
+      </w:pPr>
+      <w:r>
+        <w:rPr>
+          <w:sz w:val="20"/>
+          <w:szCs w:val="20"/>
+        </w:rPr>
+        <w:t>"occupation": "Data Scientist",</w:t>
+      </w:r>
+    </w:p>
+    <w:p>
+      <w:pPr>
+        <w:rPr>
+          <w:sz w:val="20"/>
+          <w:szCs w:val="20"/>
+        </w:rPr>
+      </w:pPr>
+      <w:r>
+        <w:rPr>
+          <w:sz w:val="20"/>
+          <w:szCs w:val="20"/>
+        </w:rPr>
+        <w:t>"city": "Kigali",</w:t>
+      </w:r>
+    </w:p>
+    <w:p>
+      <w:pPr>
+        <w:rPr>
+          <w:sz w:val="20"/>
+          <w:szCs w:val="20"/>
+        </w:rPr>
+      </w:pPr>
+      <w:r>
+        <w:rPr>
+          <w:sz w:val="20"/>
+          <w:szCs w:val="20"/>
+        </w:rPr>
+        <w:t>"research_area": "AI research on crop yield prediction"</w:t>
+      </w:r>
+    </w:p>
+    <w:p>
+      <w:pPr>
+        <w:rPr>
+          <w:sz w:val="20"/>
+          <w:szCs w:val="20"/>
+        </w:rPr>
+      </w:pPr>
+      <w:r>
+        <w:rPr>
+          <w:sz w:val="20"/>
+          <w:szCs w:val="20"/>
+        </w:rPr>
+        <w:t>}</w:t>
+      </w:r>
+    </w:p>
+    <w:p>
+      <w:pPr>
+        <w:rPr>
+          <w:sz w:val="20"/>
+          <w:szCs w:val="20"/>
+        </w:rPr>
+      </w:pPr>
+    </w:p>
+    <w:p>
+      <w:pPr>
+        <w:rPr>
+          <w:b/>
+          <w:bCs/>
+          <w:sz w:val="20"/>
+          <w:szCs w:val="20"/>
+        </w:rPr>
+      </w:pPr>
+      <w:r>
+        <w:rPr>
+          <w:b/>
+          <w:bCs/>
+          <w:sz w:val="20"/>
+          <w:szCs w:val="20"/>
+        </w:rPr>
+        <w:t>Whether json.loads worked on the first try (Yes / No)</w:t>
+      </w:r>
+    </w:p>
+    <w:p>
+      <w:pPr>
+        <w:rPr>
+          <w:sz w:val="20"/>
+          <w:szCs w:val="20"/>
+        </w:rPr>
+      </w:pPr>
+      <w:r>
+        <w:rPr>
+          <w:sz w:val="20"/>
+          <w:szCs w:val="20"/>
+        </w:rPr>
+        <w:t>Yes</w:t>
+      </w:r>
+    </w:p>
+    <w:p/>
+    <w:p>
+      <w:pPr>
+        <w:rPr>
+          <w:b/>
+          <w:bCs/>
+          <w:sz w:val="20"/>
+          <w:szCs w:val="20"/>
+        </w:rPr>
+      </w:pPr>
+      <w:r>
+        <w:rPr>
+          <w:b/>
+          <w:bCs/>
+          <w:sz w:val="20"/>
+          <w:szCs w:val="20"/>
+        </w:rPr>
+        <w:t>The printed name and research_area</w:t>
+      </w:r>
+    </w:p>
+    <w:p>
+      <w:pPr>
+        <w:rPr>
+          <w:sz w:val="20"/>
+          <w:szCs w:val="20"/>
+        </w:rPr>
+      </w:pPr>
+      <w:r>
+        <w:rPr>
+          <w:sz w:val="20"/>
+          <w:szCs w:val="20"/>
+        </w:rPr>
+        <w:t>John Smith</w:t>
+      </w:r>
+    </w:p>
+    <w:p>
+      <w:pPr>
+        <w:rPr>
+          <w:sz w:val="20"/>
+          <w:szCs w:val="20"/>
+        </w:rPr>
+      </w:pPr>
+      <w:r>
+        <w:rPr>
+          <w:sz w:val="20"/>
+          <w:szCs w:val="20"/>
+        </w:rPr>
+        <w:t>AI research on crop yield prediction</w:t>
+      </w:r>
+    </w:p>
+    <w:p>
+      <w:pPr>
+        <w:rPr>
+          <w:sz w:val="20"/>
+          <w:szCs w:val="20"/>
+        </w:rPr>
+      </w:pPr>
+    </w:p>
     <w:p/>
     <w:p/>
     <w:p/>
@@ -8972,23 +9318,9 @@
     <w:p/>
     <w:p/>
     <w:p/>
-    <w:p/>
-    <w:p/>
-    <w:p/>
-    <w:p/>
-    <w:p/>
-    <w:p>
-      <w:r>
-        <w:t>Step 5: Fixed layout (JSON) and Python</w:t>
-      </w:r>
-    </w:p>
-    <w:p>
-      <w:r>
-        <w:t>Step 6: Scoring sheet and one checked claim</w:t>
-      </w:r>
-    </w:p>
-    <w:p>
-      <w:r>
+    <w:p>
+      <w:r>
+        <w:lastRenderedPageBreak/>
         <w:t>Step 7: Optional batch run</w:t>
       </w:r>
     </w:p>

</xml_diff>